<commit_message>
Update portfolio report assets
</commit_message>
<xml_diff>
--- a/portfolio-projects/consumer-segmentation-pca-r/assets/consumer_segmentation_pca_report.docx
+++ b/portfolio-projects/consumer-segmentation-pca-r/assets/consumer_segmentation_pca_report.docx
@@ -7,7 +7,7 @@
         <w:pStyle w:val="Title"/>
       </w:pPr>
       <w:r>
-        <w:t xml:space="preserve">Assignment 1: Consumer Segmentation using PCA</w:t>
+        <w:t>Consumer Segmentation using PCA</w:t>
       </w:r>
     </w:p>
     <w:p>
@@ -15,7 +15,7 @@
         <w:pStyle w:val="Author"/>
       </w:pPr>
       <w:r>
-        <w:t xml:space="preserve">Ali Goli</w:t>
+        <w:t>Tondreka Robles</w:t>
       </w:r>
     </w:p>
     <w:p>
@@ -23,7 +23,7 @@
         <w:pStyle w:val="Date"/>
       </w:pPr>
       <w:r>
-        <w:t xml:space="preserve">Spring B 2026, MKT 472</w:t>
+        <w:t>Portfolio Version</w:t>
       </w:r>
     </w:p>
     <w:bookmarkStart w:id="20" w:name="overview"/>
@@ -63,14 +63,6 @@
     </w:p>
     <w:bookmarkEnd w:id="21"/>
     <w:bookmarkStart w:id="22" w:name="instructions"/>
-    <w:p>
-      <w:pPr>
-        <w:pStyle w:val="Heading1"/>
-      </w:pPr>
-      <w:r>
-        <w:t xml:space="preserve">Instructions</w:t>
-      </w:r>
-    </w:p>
     <w:bookmarkEnd w:id="22"/>
     <w:sectPr>
       <w:footnotePr>

</xml_diff>